<commit_message>
Xand Avião: revisão crítica da Parte 3
Co-Authored-By: Claude Opus 5.5 <noreply@anthropic.com>
Claude-Session: https://claude.ai/code/session_01MJjUEEZrxQDEUifKK2vj9g
</commit_message>
<xml_diff>
--- a/roteiros/xand-aviao/XandAviao_Parte3.docx
+++ b/roteiros/xand-aviao/XandAviao_Parte3.docx
@@ -63,7 +63,7 @@
         <w:rPr>
           <w:color w:val="000000"/>
         </w:rPr>
-        <w:t>Um dos primeiros a ser levado pelos policiais foi o empresário Isaías Duarte, um dos fundadores do Aviões do Forró.</w:t>
+        <w:t>Entre os levados pelos policiais estava o empresário Isaías Duarte, um dos fundadores do Aviões do Forró.</w:t>
       </w:r>
     </w:p>
     <w:p>
@@ -71,7 +71,7 @@
         <w:rPr>
           <w:color w:val="000000"/>
         </w:rPr>
-        <w:t>Naquela mesma manhã, a Polícia Federal explicou o que investigava.</w:t>
+        <w:t>No mesmo dia, a Polícia Federal explicou o que investigava.</w:t>
       </w:r>
     </w:p>
     <w:p>
@@ -79,7 +79,7 @@
         <w:rPr>
           <w:color w:val="000000"/>
         </w:rPr>
-        <w:t>Segundo os investigadores, as bandas do grupo declaravam à Receita só uma parte do que ganhavam. Em alguns casos, cerca de vinte por cento do valor dos shows.</w:t>
+        <w:t>Segundo os investigadores, as bandas do grupo declaravam à Receita só uma parte do que ganhavam. Entre vinte e cinquenta por cento do valor dos shows, dependendo do caso.</w:t>
       </w:r>
     </w:p>
     <w:p>
@@ -135,7 +135,7 @@
         <w:rPr>
           <w:color w:val="C00000"/>
         </w:rPr>
-        <w:t>Lembra dos discos de setecentas mil cópias e do DVD de platina diante de trinta mil pessoas? Segundo a Polícia Federal, por trás daquele sucesso corria um rio de dinheiro que nunca passava pelos papéis. E, naquela manhã, os policiais encontraram uma parte dele guardada numa sala.</w:t>
+        <w:t>Lembra dos discos de setecentas mil cópias e do DVD de platina diante de trinta mil pessoas? Segundo a Polícia Federal, por trás daquele sucesso corria um rio de dinheiro que nunca passava pelos papéis. E, naquela manhã, os policiais encontraram uma parte dele.</w:t>
       </w:r>
     </w:p>
     <w:p>
@@ -144,14 +144,6 @@
           <w:color w:val="000000"/>
         </w:rPr>
         <w:t>Numa das empresas do grupo, os agentes acharam cerca de seiscentos mil reais em dinheiro vivo.</w:t>
-      </w:r>
-    </w:p>
-    <w:p>
-      <w:r>
-        <w:rPr>
-          <w:color w:val="000000"/>
-        </w:rPr>
-        <w:t>Notas empilhadas, guardadas longe de qualquer banco.</w:t>
       </w:r>
     </w:p>
     <w:p>
@@ -223,7 +215,7 @@
         <w:rPr>
           <w:color w:val="1F4EB4"/>
         </w:rPr>
-        <w:t>A delegada responsável pelo caso, Doralucia Oliveira de Souza, explicou por que os cantores estavam na lista. Disse que eles não eram simples empregados. Eram sócios. E, como sócios, dificilmente não saberiam das irregularidades.</w:t>
+        <w:t>A delegada responsável pelo caso, Doralucia Oliveira de Souza, explicou por que os cantores estavam na lista. Lembrou que os dois eram sócios do negócio. E disse que, como sócios, eles provavelmente sabiam das irregularidades.</w:t>
       </w:r>
     </w:p>
     <w:p>
@@ -263,7 +255,7 @@
         <w:rPr>
           <w:color w:val="1F4EB4"/>
         </w:rPr>
-        <w:t>Foi naquele anúncio que ela disse a frase que o país inteiro repetiu: "Não tem briga. A gente está super bem."</w:t>
+        <w:t>Foi nessa época que ela disse a frase que você ouviu no começo desta história: "Não tem briga. A gente está super bem."</w:t>
       </w:r>
     </w:p>
     <w:p>
@@ -271,7 +263,15 @@
         <w:rPr>
           <w:color w:val="1F4EB4"/>
         </w:rPr>
-        <w:t>Ninguém ligou uma coisa à outra. Os dois vocalistas levados pela Polícia Federal em outubro. A parceria de catorze anos desfeita em dezembro.</w:t>
+        <w:t>Na época, quase ninguém ligou uma coisa à outra. Os dois vocalistas levados pela Polícia Federal em outubro. A parceria de catorze anos desfeita em dezembro.</w:t>
+      </w:r>
+    </w:p>
+    <w:p>
+      <w:r>
+        <w:rPr>
+          <w:color w:val="1F4EB4"/>
+        </w:rPr>
+        <w:t>Nenhum documento prova que uma coisa causou a outra. Mas as datas estão ali, a dois meses de distância.</w:t>
       </w:r>
     </w:p>
     <w:p>
@@ -319,7 +319,7 @@
         <w:rPr>
           <w:color w:val="000000"/>
         </w:rPr>
-        <w:t>A turnê de despedida que ela esperava nunca aconteceu.</w:t>
+        <w:t>Segundo ela, a turnê de despedida prometida não aconteceu.</w:t>
       </w:r>
     </w:p>
     <w:p>
@@ -327,7 +327,15 @@
         <w:rPr>
           <w:color w:val="000000"/>
         </w:rPr>
-        <w:t>Em janeiro de dois mil e dezessete, Xand foi até Salvador e tatuou no braço a marca que ia carregar dali em diante. Mudou o nome artístico. Passou a se apresentar como Xand Avião.</w:t>
+        <w:t>O resto você já conhece. A tatuagem em Salvador. O novo nome, Xand Avião. O último show no Piauí, na terça de Carnaval.</w:t>
+      </w:r>
+    </w:p>
+    <w:p>
+      <w:r>
+        <w:rPr>
+          <w:color w:val="C00000"/>
+        </w:rPr>
+        <w:t>Guarde esse Carnaval no Piauí. Porque foi naquela mesma viagem, segundo Solange, que os dois foram colocados juntos num quarto de hotel. E o que aconteceu dentro daquele quarto ela só ia contar em detalhes quase nove anos depois.</w:t>
       </w:r>
     </w:p>
     <w:p>
@@ -335,7 +343,7 @@
         <w:rPr>
           <w:color w:val="000000"/>
         </w:rPr>
-        <w:t>Vinte e oito de fevereiro. Luís Correia, Piauí. O último show dos dois.</w:t>
+        <w:t>Anos depois, num podcast, Xand falou pela primeira vez do que sentiu quando a banda foi embora com ela.</w:t>
       </w:r>
     </w:p>
     <w:p>
@@ -343,47 +351,7 @@
         <w:rPr>
           <w:color w:val="000000"/>
         </w:rPr>
-        <w:t>Abraços no palco. Lágrimas. Mensagens de carinho nas redes.</w:t>
-      </w:r>
-    </w:p>
-    <w:p>
-      <w:r>
-        <w:rPr>
-          <w:color w:val="C00000"/>
-        </w:rPr>
-        <w:t>Guarde esse Carnaval no Piauí. Porque foi naquela mesma viagem, segundo Solange, que os dois foram colocados juntos num quarto de hotel. E o que aconteceu dentro daquele quarto só ia ser contado quase nove anos depois.</w:t>
-      </w:r>
-    </w:p>
-    <w:p>
-      <w:r>
-        <w:rPr>
-          <w:color w:val="000000"/>
-        </w:rPr>
-        <w:t>Quando Solange desceu do palco pela última vez, a banda foi junto com ela.</w:t>
-      </w:r>
-    </w:p>
-    <w:p>
-      <w:r>
-        <w:rPr>
-          <w:color w:val="000000"/>
-        </w:rPr>
-        <w:t>Anos depois, num podcast, Xand contou como foi aquele momento.</w:t>
-      </w:r>
-    </w:p>
-    <w:p>
-      <w:r>
-        <w:rPr>
-          <w:color w:val="000000"/>
-        </w:rPr>
-        <w:t>"Eu fiquei com muito medo, porque a banda foi inteira com ela. Eu fiquei com o motorista do ônibus e um tecladista."</w:t>
-      </w:r>
-    </w:p>
-    <w:p>
-      <w:r>
-        <w:rPr>
-          <w:color w:val="000000"/>
-        </w:rPr>
-        <w:t>O maior fenômeno do forró brasileiro tinha virado um ônibus quase vazio.</w:t>
+        <w:t>"Eu fiquei com muito medo."</w:t>
       </w:r>
     </w:p>
     <w:p>
@@ -471,7 +439,7 @@
         <w:rPr>
           <w:color w:val="C00000"/>
         </w:rPr>
-        <w:t>Só que, um mês depois do lançamento do DVD, em junho de dois mil e dezenove, duas notícias explodiram quase ao mesmo tempo. Uma vinha de Brasília, do Ministério Público Federal. A outra vinha de um tribunal, com a assinatura de Solange. E as duas atingiam diretamente o passado que Xand estava tentando deixar para trás.</w:t>
+        <w:t>Só que, um mês depois do lançamento do DVD, uma notícia do Ministério Público Federal explodiu. E, naquele mesmo ano, outra chegou de um tribunal, com a assinatura de Solange. As duas atingiam em cheio o passado que Xand estava tentando deixar para trás.</w:t>
       </w:r>
     </w:p>
     <w:sectPr>

</xml_diff>